<commit_message>
Add new session sources and working draft for AI-Enabled Cost Transformation
- Created `sources.json` for session ID `sample-upgrade-20260206-174838` with relevant internal documents and benchmarks.
- Added `working-draft.md` detailing the agenda, value pool sizing, delivery options, mobilization workflow, benchmark snapshot, recommendations, and key risks for the AI-Enabled Cost Transformation session.
- Updated various industry scope libraries and documentation for consistency in spelling and terminology.
- Introduced scripts for checking spelling and style consistency in scope library texts.
</commit_message>
<xml_diff>
--- a/chatgpt/ts-eng-asst/dist/buyside-engagement-letter.docx
+++ b/chatgpt/ts-eng-asst/dist/buyside-engagement-letter.docx
@@ -138,7 +138,51 @@
           <w:sz w:val="20"/>
           <w:highlight w:val="yellow"/>
         </w:rPr>
-        <w:t>{{GUIDANCE_01}}</w:t>
+        <w:t>{{</w:t>
+      </w:r>
+      <w:r>
+        <w:rPr>
+          <w:rFonts w:asciiTheme="minorHAnsi" w:hAnsiTheme="minorHAnsi" w:cstheme="minorHAnsi"/>
+          <w:i/>
+          <w:iCs/>
+          <w:color w:val="FF0000"/>
+          <w:sz w:val="20"/>
+          <w:highlight w:val="yellow"/>
+        </w:rPr>
+        <w:t xml:space="preserve"> </w:t>
+      </w:r>
+      <w:r>
+        <w:rPr>
+          <w:rFonts w:asciiTheme="minorHAnsi" w:hAnsiTheme="minorHAnsi" w:cstheme="minorHAnsi"/>
+          <w:i/>
+          <w:iCs/>
+          <w:color w:val="FF0000"/>
+          <w:sz w:val="20"/>
+          <w:highlight w:val="yellow"/>
+        </w:rPr>
+        <w:t>Ensure your SAN has the exact addressee of this EL as an Engaging Party and that this addressee also has an approved CEAC Client Acceptance with KPMG Canada. This is the “3-way match” concept</w:t>
+      </w:r>
+      <w:r>
+        <w:rPr>
+          <w:rFonts w:asciiTheme="minorHAnsi" w:hAnsiTheme="minorHAnsi" w:cstheme="minorHAnsi"/>
+          <w:i/>
+          <w:iCs/>
+          <w:color w:val="FF0000"/>
+          <w:sz w:val="20"/>
+          <w:highlight w:val="yellow"/>
+        </w:rPr>
+        <w:t>.</w:t>
+      </w:r>
+      <w:r>
+        <w:rPr>
+          <w:rFonts w:asciiTheme="minorHAnsi" w:hAnsiTheme="minorHAnsi" w:cstheme="minorHAnsi"/>
+          <w:i/>
+          <w:iCs/>
+          <w:color w:val="FF0000"/>
+          <w:sz w:val="20"/>
+          <w:highlight w:val="yellow"/>
+        </w:rPr>
+        <w:t>}}</w:t>
       </w:r>
     </w:p>
     <w:p>
@@ -577,23 +621,7 @@
           <w:rFonts w:asciiTheme="minorHAnsi" w:hAnsiTheme="minorHAnsi" w:cstheme="minorHAnsi"/>
           <w:sz w:val="20"/>
         </w:rPr>
-        <w:t xml:space="preserve">Our report will be prepared on the basis that you will provide us with all relevant information that you have received concerning Target. We have no obligation to update our report or to revise the information contained therein because of events and transactions occurring </w:t>
-      </w:r>
-      <w:proofErr w:type="gramStart"/>
-      <w:r>
-        <w:rPr>
-          <w:rFonts w:asciiTheme="minorHAnsi" w:hAnsiTheme="minorHAnsi" w:cstheme="minorHAnsi"/>
-          <w:sz w:val="20"/>
-        </w:rPr>
-        <w:t>subsequent to</w:t>
-      </w:r>
-      <w:proofErr w:type="gramEnd"/>
-      <w:r>
-        <w:rPr>
-          <w:rFonts w:asciiTheme="minorHAnsi" w:hAnsiTheme="minorHAnsi" w:cstheme="minorHAnsi"/>
-          <w:sz w:val="20"/>
-        </w:rPr>
-        <w:t xml:space="preserve"> the date of the report.</w:t>
+        <w:t>Our report will be prepared on the basis that you will provide us with all relevant information that you have received concerning Target. We have no obligation to update our report or to revise the information contained therein because of events and transactions occurring subsequent to the date of the report.</w:t>
       </w:r>
     </w:p>
     <w:p>
@@ -683,71 +711,7 @@
           <w:rFonts w:asciiTheme="minorHAnsi" w:hAnsiTheme="minorHAnsi" w:cstheme="minorHAnsi"/>
           <w:sz w:val="20"/>
         </w:rPr>
-        <w:t xml:space="preserve"> of the Standard Terms and Conditions which restrict the circulation of our report. However, with our prior written permission, should you wish to circulate the report to other parties on a non-reliance basis and for informational purposes only, we will request that you (a) sign a release and indemnity in </w:t>
-      </w:r>
-      <w:proofErr w:type="spellStart"/>
-      <w:r>
-        <w:rPr>
-          <w:rFonts w:asciiTheme="minorHAnsi" w:hAnsiTheme="minorHAnsi" w:cstheme="minorHAnsi"/>
-          <w:sz w:val="20"/>
-        </w:rPr>
-        <w:t>favour</w:t>
-      </w:r>
-      <w:proofErr w:type="spellEnd"/>
-      <w:r>
-        <w:rPr>
-          <w:rFonts w:asciiTheme="minorHAnsi" w:hAnsiTheme="minorHAnsi" w:cstheme="minorHAnsi"/>
-          <w:sz w:val="20"/>
-        </w:rPr>
-        <w:t xml:space="preserve"> of KPMG (Client Release Letter) related to the distribution of the report, and (b) provide a written acknowledgment from you and the requesting party of the terms of the release of the report (Third Party Access Letter), each in the form respectively attached in Appendix C. The Client Consent Letter and </w:t>
-      </w:r>
-      <w:proofErr w:type="gramStart"/>
-      <w:r>
-        <w:rPr>
-          <w:rFonts w:asciiTheme="minorHAnsi" w:hAnsiTheme="minorHAnsi" w:cstheme="minorHAnsi"/>
-          <w:sz w:val="20"/>
-        </w:rPr>
-        <w:t>Third Party</w:t>
-      </w:r>
-      <w:proofErr w:type="gramEnd"/>
-      <w:r>
-        <w:rPr>
-          <w:rFonts w:asciiTheme="minorHAnsi" w:hAnsiTheme="minorHAnsi" w:cstheme="minorHAnsi"/>
-          <w:sz w:val="20"/>
-        </w:rPr>
-        <w:t xml:space="preserve"> Access Letter must be returned to us prior to any release of the report. If you would like Target to review our report, we will require a Client Consent Letter and a </w:t>
-      </w:r>
-      <w:proofErr w:type="gramStart"/>
-      <w:r>
-        <w:rPr>
-          <w:rFonts w:asciiTheme="minorHAnsi" w:hAnsiTheme="minorHAnsi" w:cstheme="minorHAnsi"/>
-          <w:sz w:val="20"/>
-        </w:rPr>
-        <w:t>Third Party</w:t>
-      </w:r>
-      <w:proofErr w:type="gramEnd"/>
-      <w:r>
-        <w:rPr>
-          <w:rFonts w:asciiTheme="minorHAnsi" w:hAnsiTheme="minorHAnsi" w:cstheme="minorHAnsi"/>
-          <w:sz w:val="20"/>
-        </w:rPr>
-        <w:t xml:space="preserve"> Access Letter, but the form of </w:t>
-      </w:r>
-      <w:proofErr w:type="gramStart"/>
-      <w:r>
-        <w:rPr>
-          <w:rFonts w:asciiTheme="minorHAnsi" w:hAnsiTheme="minorHAnsi" w:cstheme="minorHAnsi"/>
-          <w:sz w:val="20"/>
-        </w:rPr>
-        <w:t>Third Party</w:t>
-      </w:r>
-      <w:proofErr w:type="gramEnd"/>
-      <w:r>
-        <w:rPr>
-          <w:rFonts w:asciiTheme="minorHAnsi" w:hAnsiTheme="minorHAnsi" w:cstheme="minorHAnsi"/>
-          <w:sz w:val="20"/>
-        </w:rPr>
-        <w:t xml:space="preserve"> Access Letter may vary from that attached as Appendix C as specified by KPMG in its sole discretion.</w:t>
+        <w:t xml:space="preserve"> of the Standard Terms and Conditions which restrict the circulation of our report. However, with our prior written permission, should you wish to circulate the report to other parties on a non-reliance basis and for informational purposes only, we will request that you (a) sign a release and indemnity in favour of KPMG (Client Release Letter) related to the distribution of the report, and (b) provide a written acknowledgment from you and the requesting party of the terms of the release of the report (Third Party Access Letter), each in the form respectively attached in Appendix C. The Client Consent Letter and Third Party Access Letter must be returned to us prior to any release of the report. If you would like Target to review our report, we will require a Client Consent Letter and a Third Party Access Letter, but the form of Third Party Access Letter may vary from that attached as Appendix C as specified by KPMG in its sole discretion.</w:t>
       </w:r>
     </w:p>
     <w:p>
@@ -975,23 +939,7 @@
           <w:rFonts w:asciiTheme="minorHAnsi" w:hAnsiTheme="minorHAnsi" w:cstheme="minorHAnsi"/>
           <w:sz w:val="20"/>
         </w:rPr>
-        <w:t xml:space="preserve">To the fullest extent permitted by law, KPMG is not liable to Client for any consequences, claims, penalties, fines, actions, proceedings, liabilities, costs, expenses, losses, or demands that may result or arise from or otherwise </w:t>
-      </w:r>
-      <w:proofErr w:type="gramStart"/>
-      <w:r>
-        <w:rPr>
-          <w:rFonts w:asciiTheme="minorHAnsi" w:hAnsiTheme="minorHAnsi" w:cstheme="minorHAnsi"/>
-          <w:sz w:val="20"/>
-        </w:rPr>
-        <w:t>be connected with</w:t>
-      </w:r>
-      <w:proofErr w:type="gramEnd"/>
-      <w:r>
-        <w:rPr>
-          <w:rFonts w:asciiTheme="minorHAnsi" w:hAnsiTheme="minorHAnsi" w:cstheme="minorHAnsi"/>
-          <w:sz w:val="20"/>
-        </w:rPr>
-        <w:t xml:space="preserve"> any disclosure under MDRs.</w:t>
+        <w:t>To the fullest extent permitted by law, KPMG is not liable to Client for any consequences, claims, penalties, fines, actions, proceedings, liabilities, costs, expenses, losses, or demands that may result or arise from or otherwise be connected with any disclosure under MDRs.</w:t>
       </w:r>
     </w:p>
     <w:p>
@@ -1033,23 +981,7 @@
           <w:rFonts w:asciiTheme="minorHAnsi" w:hAnsiTheme="minorHAnsi" w:cstheme="minorHAnsi"/>
           <w:sz w:val="20"/>
         </w:rPr>
-        <w:t xml:space="preserve">If Client carries on business or resides in Québec, KPMG wishes to advise you that Québec introduced legislation that prohibits a taxpayer who has carried out a transaction, or series of transactions, that is subject to a </w:t>
-      </w:r>
-      <w:proofErr w:type="spellStart"/>
-      <w:r>
-        <w:rPr>
-          <w:rFonts w:asciiTheme="minorHAnsi" w:hAnsiTheme="minorHAnsi" w:cstheme="minorHAnsi"/>
-          <w:sz w:val="20"/>
-        </w:rPr>
-        <w:t>Revenu</w:t>
-      </w:r>
-      <w:proofErr w:type="spellEnd"/>
-      <w:r>
-        <w:rPr>
-          <w:rFonts w:asciiTheme="minorHAnsi" w:hAnsiTheme="minorHAnsi" w:cstheme="minorHAnsi"/>
-          <w:sz w:val="20"/>
-        </w:rPr>
-        <w:t xml:space="preserve"> Québec final assessment based on the general anti-avoidance rule, from being able to obtain authorization from the </w:t>
+        <w:t xml:space="preserve">If Client carries on business or resides in Québec, KPMG wishes to advise you that Québec introduced legislation that prohibits a taxpayer who has carried out a transaction, or series of transactions, that is subject to a Revenu Québec final assessment based on the general anti-avoidance rule, from being able to obtain authorization from the </w:t>
       </w:r>
       <w:r>
         <w:rPr>
@@ -1058,27 +990,7 @@
           <w:iCs/>
           <w:sz w:val="20"/>
         </w:rPr>
-        <w:t xml:space="preserve">Autorité des </w:t>
-      </w:r>
-      <w:proofErr w:type="spellStart"/>
-      <w:r>
-        <w:rPr>
-          <w:rFonts w:asciiTheme="minorHAnsi" w:hAnsiTheme="minorHAnsi" w:cstheme="minorHAnsi"/>
-          <w:i/>
-          <w:iCs/>
-          <w:sz w:val="20"/>
-        </w:rPr>
-        <w:t>marchés</w:t>
-      </w:r>
-      <w:proofErr w:type="spellEnd"/>
-      <w:r>
-        <w:rPr>
-          <w:rFonts w:asciiTheme="minorHAnsi" w:hAnsiTheme="minorHAnsi" w:cstheme="minorHAnsi"/>
-          <w:i/>
-          <w:iCs/>
-          <w:sz w:val="20"/>
-        </w:rPr>
-        <w:t xml:space="preserve"> publics</w:t>
+        <w:t>Autorité des marchés publics</w:t>
       </w:r>
       <w:r>
         <w:rPr>
@@ -1181,23 +1093,7 @@
           <w:rFonts w:asciiTheme="minorHAnsi" w:hAnsiTheme="minorHAnsi" w:cstheme="minorHAnsi"/>
           <w:sz w:val="20"/>
         </w:rPr>
-        <w:t xml:space="preserve"> of KPMG. Therefore, the scope of our work is subject to certain limitations </w:t>
-      </w:r>
-      <w:proofErr w:type="gramStart"/>
-      <w:r>
-        <w:rPr>
-          <w:rFonts w:asciiTheme="minorHAnsi" w:hAnsiTheme="minorHAnsi" w:cstheme="minorHAnsi"/>
-          <w:sz w:val="20"/>
-        </w:rPr>
-        <w:t>in order to</w:t>
-      </w:r>
-      <w:proofErr w:type="gramEnd"/>
-      <w:r>
-        <w:rPr>
-          <w:rFonts w:asciiTheme="minorHAnsi" w:hAnsiTheme="minorHAnsi" w:cstheme="minorHAnsi"/>
-          <w:sz w:val="20"/>
-        </w:rPr>
-        <w:t xml:space="preserve"> maintain our independence. Accordingly, in this engagement we will not make any recommendation to invest (or not invest) in Target or pursue other opportunities in the market. </w:t>
+        <w:t xml:space="preserve"> of KPMG. Therefore, the scope of our work is subject to certain limitations in order to maintain our independence. Accordingly, in this engagement we will not make any recommendation to invest (or not invest) in Target or pursue other opportunities in the market. </w:t>
       </w:r>
     </w:p>
     <w:p>
@@ -1252,21 +1148,12 @@
           <w:sz w:val="20"/>
         </w:rPr>
       </w:pPr>
-      <w:proofErr w:type="gramStart"/>
-      <w:r>
-        <w:rPr>
-          <w:rFonts w:asciiTheme="minorHAnsi" w:hAnsiTheme="minorHAnsi" w:cstheme="minorHAnsi"/>
-          <w:sz w:val="20"/>
-        </w:rPr>
-        <w:t>With regard to</w:t>
-      </w:r>
-      <w:proofErr w:type="gramEnd"/>
-      <w:r>
-        <w:rPr>
-          <w:rFonts w:asciiTheme="minorHAnsi" w:hAnsiTheme="minorHAnsi" w:cstheme="minorHAnsi"/>
-          <w:sz w:val="20"/>
-        </w:rPr>
-        <w:t xml:space="preserve"> KPMG’s services delivered in accordance with this engagement letter, Client is responsible for: </w:t>
+      <w:r>
+        <w:rPr>
+          <w:rFonts w:asciiTheme="minorHAnsi" w:hAnsiTheme="minorHAnsi" w:cstheme="minorHAnsi"/>
+          <w:sz w:val="20"/>
+        </w:rPr>
+        <w:t xml:space="preserve">With regard to KPMG’s services delivered in accordance with this engagement letter, Client is responsible for: </w:t>
       </w:r>
     </w:p>
     <w:p>
@@ -1308,17 +1195,8 @@
           <w:rFonts w:asciiTheme="minorHAnsi" w:hAnsiTheme="minorHAnsi" w:cstheme="minorHAnsi"/>
           <w:sz w:val="20"/>
         </w:rPr>
-        <w:t xml:space="preserve">will fulfill these </w:t>
-      </w:r>
-      <w:proofErr w:type="gramStart"/>
-      <w:r>
-        <w:rPr>
-          <w:rFonts w:asciiTheme="minorHAnsi" w:hAnsiTheme="minorHAnsi" w:cstheme="minorHAnsi"/>
-          <w:sz w:val="20"/>
-        </w:rPr>
-        <w:t>responsibilities;</w:t>
-      </w:r>
-      <w:proofErr w:type="gramEnd"/>
+        <w:t>will fulfill these responsibilities;</w:t>
+      </w:r>
     </w:p>
     <w:p>
       <w:pPr>
@@ -1338,17 +1216,8 @@
           <w:rFonts w:asciiTheme="minorHAnsi" w:hAnsiTheme="minorHAnsi" w:cstheme="minorHAnsi"/>
           <w:sz w:val="20"/>
         </w:rPr>
-        <w:t xml:space="preserve">determining the objectives, scope, and extent of KPMG’s </w:t>
-      </w:r>
-      <w:proofErr w:type="gramStart"/>
-      <w:r>
-        <w:rPr>
-          <w:rFonts w:asciiTheme="minorHAnsi" w:hAnsiTheme="minorHAnsi" w:cstheme="minorHAnsi"/>
-          <w:sz w:val="20"/>
-        </w:rPr>
-        <w:t>services;</w:t>
-      </w:r>
-      <w:proofErr w:type="gramEnd"/>
+        <w:t>determining the objectives, scope, and extent of KPMG’s services;</w:t>
+      </w:r>
     </w:p>
     <w:p>
       <w:pPr>
@@ -1754,30 +1623,14 @@
           <w:rFonts w:asciiTheme="minorHAnsi" w:hAnsiTheme="minorHAnsi" w:cstheme="minorHAnsi"/>
           <w:sz w:val="20"/>
         </w:rPr>
-        <w:t>{{FEE_DISCOUNT_CLAUSE</w:t>
-      </w:r>
-      <w:proofErr w:type="gramStart"/>
-      <w:r>
-        <w:rPr>
-          <w:rFonts w:asciiTheme="minorHAnsi" w:hAnsiTheme="minorHAnsi" w:cstheme="minorHAnsi"/>
-          <w:sz w:val="20"/>
-        </w:rPr>
-        <w:t>}}</w:t>
-      </w:r>
-      <w:r>
-        <w:rPr>
-          <w:rFonts w:asciiTheme="minorHAnsi" w:hAnsiTheme="minorHAnsi" w:cstheme="minorHAnsi"/>
-          <w:sz w:val="20"/>
-        </w:rPr>
-        <w:t>%</w:t>
-      </w:r>
-      <w:proofErr w:type="gramEnd"/>
-      <w:r>
-        <w:rPr>
-          <w:rFonts w:asciiTheme="minorHAnsi" w:hAnsiTheme="minorHAnsi" w:cstheme="minorHAnsi"/>
-          <w:sz w:val="20"/>
-        </w:rPr>
-        <w:t xml:space="preserve"> discount from our </w:t>
+        <w:t>{{FEE_DISCOUNT_CLAUSE}}</w:t>
+      </w:r>
+      <w:r>
+        <w:rPr>
+          <w:rFonts w:asciiTheme="minorHAnsi" w:hAnsiTheme="minorHAnsi" w:cstheme="minorHAnsi"/>
+          <w:sz w:val="20"/>
+        </w:rPr>
+        <w:t xml:space="preserve">% discount from our </w:t>
       </w:r>
       <w:r>
         <w:rPr>
@@ -1820,30 +1673,14 @@
           <w:rFonts w:asciiTheme="minorHAnsi" w:hAnsiTheme="minorHAnsi" w:cstheme="minorHAnsi"/>
           <w:sz w:val="20"/>
         </w:rPr>
-        <w:t>{{FEE_NET_CLAUSE</w:t>
-      </w:r>
-      <w:proofErr w:type="gramStart"/>
-      <w:r>
-        <w:rPr>
-          <w:rFonts w:asciiTheme="minorHAnsi" w:hAnsiTheme="minorHAnsi" w:cstheme="minorHAnsi"/>
-          <w:sz w:val="20"/>
-        </w:rPr>
-        <w:t>}}</w:t>
-      </w:r>
-      <w:r>
-        <w:rPr>
-          <w:rFonts w:asciiTheme="minorHAnsi" w:hAnsiTheme="minorHAnsi" w:cstheme="minorHAnsi"/>
-          <w:sz w:val="20"/>
-        </w:rPr>
-        <w:t>%</w:t>
-      </w:r>
-      <w:proofErr w:type="gramEnd"/>
-      <w:r>
-        <w:rPr>
-          <w:rFonts w:asciiTheme="minorHAnsi" w:hAnsiTheme="minorHAnsi" w:cstheme="minorHAnsi"/>
-          <w:sz w:val="20"/>
-        </w:rPr>
-        <w:t xml:space="preserve"> discount)</w:t>
+        <w:t>{{FEE_NET_CLAUSE}}</w:t>
+      </w:r>
+      <w:r>
+        <w:rPr>
+          <w:rFonts w:asciiTheme="minorHAnsi" w:hAnsiTheme="minorHAnsi" w:cstheme="minorHAnsi"/>
+          <w:sz w:val="20"/>
+        </w:rPr>
+        <w:t>% discount)</w:t>
       </w:r>
       <w:r>
         <w:rPr>
@@ -2088,23 +1925,7 @@
           <w:rFonts w:asciiTheme="minorHAnsi" w:hAnsiTheme="minorHAnsi" w:cstheme="minorHAnsi"/>
           <w:sz w:val="20"/>
         </w:rPr>
-        <w:t xml:space="preserve">% technology and support charge to cover information technology infrastructure costs and administrative support of our client service personnel which are not included in our professional fees. The technology and support charge covers costs such as our client service personnel computer hardware and customized KPMG software, telecommunications equipment, client service professional administrative support, IT programming professional services and other client support services. Reasonable out-of-pocket costs, such as travel, meals, accommodations, and </w:t>
-      </w:r>
-      <w:proofErr w:type="gramStart"/>
-      <w:r>
-        <w:rPr>
-          <w:rFonts w:asciiTheme="minorHAnsi" w:hAnsiTheme="minorHAnsi" w:cstheme="minorHAnsi"/>
-          <w:sz w:val="20"/>
-        </w:rPr>
-        <w:t>third party</w:t>
-      </w:r>
-      <w:proofErr w:type="gramEnd"/>
-      <w:r>
-        <w:rPr>
-          <w:rFonts w:asciiTheme="minorHAnsi" w:hAnsiTheme="minorHAnsi" w:cstheme="minorHAnsi"/>
-          <w:sz w:val="20"/>
-        </w:rPr>
-        <w:t xml:space="preserve"> database costs, will be charged in addition based on our actual costs.</w:t>
+        <w:t>% technology and support charge to cover information technology infrastructure costs and administrative support of our client service personnel which are not included in our professional fees. The technology and support charge covers costs such as our client service personnel computer hardware and customized KPMG software, telecommunications equipment, client service professional administrative support, IT programming professional services and other client support services. Reasonable out-of-pocket costs, such as travel, meals, accommodations, and third party database costs, will be charged in addition based on our actual costs.</w:t>
       </w:r>
     </w:p>
     <w:p>
@@ -2138,23 +1959,7 @@
           <w:rFonts w:asciiTheme="minorHAnsi" w:hAnsiTheme="minorHAnsi" w:cstheme="minorHAnsi"/>
           <w:sz w:val="20"/>
         </w:rPr>
-        <w:t xml:space="preserve">Additional costs may be required </w:t>
-      </w:r>
-      <w:proofErr w:type="gramStart"/>
-      <w:r>
-        <w:rPr>
-          <w:rFonts w:asciiTheme="minorHAnsi" w:hAnsiTheme="minorHAnsi" w:cstheme="minorHAnsi"/>
-          <w:sz w:val="20"/>
-        </w:rPr>
-        <w:t>as a result of</w:t>
-      </w:r>
-      <w:proofErr w:type="gramEnd"/>
-      <w:r>
-        <w:rPr>
-          <w:rFonts w:asciiTheme="minorHAnsi" w:hAnsiTheme="minorHAnsi" w:cstheme="minorHAnsi"/>
-          <w:sz w:val="20"/>
-        </w:rPr>
-        <w:t xml:space="preserve"> any material change in the engagement or difficulties in obtaining information which could not reasonably be foreseen and which cause additional work not included in the original fee estimate. We will discuss and obtain approval from you of any material changes in the engagement or difficulties in obtaining information prior to performing any additional work.</w:t>
+        <w:t>Additional costs may be required as a result of any material change in the engagement or difficulties in obtaining information which could not reasonably be foreseen and which cause additional work not included in the original fee estimate. We will discuss and obtain approval from you of any material changes in the engagement or difficulties in obtaining information prior to performing any additional work.</w:t>
       </w:r>
     </w:p>
     <w:p>
@@ -2429,31 +2234,7 @@
           <w:sz w:val="20"/>
           <w:highlight w:val="yellow"/>
         </w:rPr>
-        <w:t xml:space="preserve">: If the Sentinel Resolver identified a professional conflict that must be disclosed to the client and that </w:t>
-      </w:r>
-      <w:proofErr w:type="gramStart"/>
-      <w:r>
-        <w:rPr>
-          <w:rFonts w:asciiTheme="minorHAnsi" w:hAnsiTheme="minorHAnsi" w:cstheme="minorHAnsi"/>
-          <w:i/>
-          <w:iCs/>
-          <w:color w:val="FF0000"/>
-          <w:sz w:val="20"/>
-          <w:highlight w:val="yellow"/>
-        </w:rPr>
-        <w:t>requires</w:t>
-      </w:r>
-      <w:proofErr w:type="gramEnd"/>
-      <w:r>
-        <w:rPr>
-          <w:rFonts w:asciiTheme="minorHAnsi" w:hAnsiTheme="minorHAnsi" w:cstheme="minorHAnsi"/>
-          <w:i/>
-          <w:iCs/>
-          <w:color w:val="FF0000"/>
-          <w:sz w:val="20"/>
-          <w:highlight w:val="yellow"/>
-        </w:rPr>
-        <w:t xml:space="preserve"> we obtain a release and indemnity, keep these sections below and tailor to the specific situation. If there has been no professional conflict identified, then the three sections below (i.e. “Other Relationships”, “Ethical Divider and Confidentiality Procedures”, and “Consent, Release and Indemnity”, must be deleted entirely as you have nothing to disclose and there is no mandatory requirement to outline our standard Ethical Divider and Confidentiality Procedures in our engagement letters.]</w:t>
+        <w:t>: If the Sentinel Resolver identified a professional conflict that must be disclosed to the client and that requires we obtain a release and indemnity, keep these sections below and tailor to the specific situation. If there has been no professional conflict identified, then the three sections below (i.e. “Other Relationships”, “Ethical Divider and Confidentiality Procedures”, and “Consent, Release and Indemnity”, must be deleted entirely as you have nothing to disclose and there is no mandatory requirement to outline our standard Ethical Divider and Confidentiality Procedures in our engagement letters.]</w:t>
       </w:r>
     </w:p>
     <w:p>
@@ -2643,31 +2424,7 @@
           <w:sz w:val="20"/>
           <w:highlight w:val="yellow"/>
         </w:rPr>
-        <w:t xml:space="preserve">: Depending on the specific situation identified by the Resolver, different confidentiality procedures may be necessary. Consult the Advisory RM Portal and find guidance in the “Conflicts of Interest” area to find and insert the applicable template wording which describes the confidentiality procedures (e.g. Appendix 6a, Appendix 7, Appendix 10, etc.) that apply to your specific situation. All wording must be </w:t>
-      </w:r>
-      <w:proofErr w:type="gramStart"/>
-      <w:r>
-        <w:rPr>
-          <w:rFonts w:asciiTheme="minorHAnsi" w:hAnsiTheme="minorHAnsi" w:cstheme="minorHAnsi"/>
-          <w:i/>
-          <w:iCs/>
-          <w:color w:val="FF0000"/>
-          <w:sz w:val="20"/>
-          <w:highlight w:val="yellow"/>
-        </w:rPr>
-        <w:t>tailored</w:t>
-      </w:r>
-      <w:proofErr w:type="gramEnd"/>
-      <w:r>
-        <w:rPr>
-          <w:rFonts w:asciiTheme="minorHAnsi" w:hAnsiTheme="minorHAnsi" w:cstheme="minorHAnsi"/>
-          <w:i/>
-          <w:iCs/>
-          <w:color w:val="FF0000"/>
-          <w:sz w:val="20"/>
-          <w:highlight w:val="yellow"/>
-        </w:rPr>
-        <w:t xml:space="preserve"> and engagement teams are required to fulfil all promises made to the Client.]</w:t>
+        <w:t>: Depending on the specific situation identified by the Resolver, different confidentiality procedures may be necessary. Consult the Advisory RM Portal and find guidance in the “Conflicts of Interest” area to find and insert the applicable template wording which describes the confidentiality procedures (e.g. Appendix 6a, Appendix 7, Appendix 10, etc.) that apply to your specific situation. All wording must be tailored and engagement teams are required to fulfil all promises made to the Client.]</w:t>
       </w:r>
     </w:p>
     <w:p>
@@ -2705,23 +2462,7 @@
           <w:rFonts w:asciiTheme="minorHAnsi" w:hAnsiTheme="minorHAnsi" w:cstheme="minorHAnsi"/>
           <w:sz w:val="20"/>
         </w:rPr>
-        <w:t xml:space="preserve">By signing this letter, you confirm that Client is satisfied with the foregoing confidentiality </w:t>
-      </w:r>
-      <w:proofErr w:type="gramStart"/>
-      <w:r>
-        <w:rPr>
-          <w:rFonts w:asciiTheme="minorHAnsi" w:hAnsiTheme="minorHAnsi" w:cstheme="minorHAnsi"/>
-          <w:sz w:val="20"/>
-        </w:rPr>
-        <w:t>procedures</w:t>
-      </w:r>
-      <w:proofErr w:type="gramEnd"/>
-      <w:r>
-        <w:rPr>
-          <w:rFonts w:asciiTheme="minorHAnsi" w:hAnsiTheme="minorHAnsi" w:cstheme="minorHAnsi"/>
-          <w:sz w:val="20"/>
-        </w:rPr>
-        <w:t xml:space="preserve"> and you further agree that Client:</w:t>
+        <w:t>By signing this letter, you confirm that Client is satisfied with the foregoing confidentiality procedures and you further agree that Client:</w:t>
       </w:r>
     </w:p>
     <w:p>
@@ -3201,7 +2942,6 @@
         </w:rPr>
         <w:t xml:space="preserve">: </w:t>
       </w:r>
-      <w:proofErr w:type="gramStart"/>
       <w:r>
         <w:rPr>
           <w:rFonts w:asciiTheme="minorHAnsi" w:hAnsiTheme="minorHAnsi" w:cstheme="minorHAnsi"/>
@@ -3211,9 +2951,8 @@
           <w:sz w:val="20"/>
           <w:highlight w:val="yellow"/>
         </w:rPr>
-        <w:t>non Canada</w:t>
-      </w:r>
-      <w:proofErr w:type="gramEnd"/>
+        <w:t xml:space="preserve">non Canada CPA partners must </w:t>
+      </w:r>
       <w:r>
         <w:rPr>
           <w:rFonts w:asciiTheme="minorHAnsi" w:hAnsiTheme="minorHAnsi" w:cstheme="minorHAnsi"/>
@@ -3223,7 +2962,7 @@
           <w:sz w:val="20"/>
           <w:highlight w:val="yellow"/>
         </w:rPr>
-        <w:t xml:space="preserve"> CPA partners must </w:t>
+        <w:t xml:space="preserve">use the following </w:t>
       </w:r>
       <w:r>
         <w:rPr>
@@ -3234,7 +2973,7 @@
           <w:sz w:val="20"/>
           <w:highlight w:val="yellow"/>
         </w:rPr>
-        <w:t xml:space="preserve">use the following </w:t>
+        <w:t>below the partner’s signature since such partners must be referred to as authorized signatories when binding KPMG LLP to contracts</w:t>
       </w:r>
       <w:r>
         <w:rPr>
@@ -3245,17 +2984,6 @@
           <w:sz w:val="20"/>
           <w:highlight w:val="yellow"/>
         </w:rPr>
-        <w:t>below the partner’s signature since such partners must be referred to as authorized signatories when binding KPMG LLP to contracts</w:t>
-      </w:r>
-      <w:r>
-        <w:rPr>
-          <w:rFonts w:asciiTheme="minorHAnsi" w:hAnsiTheme="minorHAnsi" w:cstheme="minorHAnsi"/>
-          <w:i/>
-          <w:iCs/>
-          <w:color w:val="FF0000"/>
-          <w:sz w:val="20"/>
-          <w:highlight w:val="yellow"/>
-        </w:rPr>
         <w:t>]</w:t>
       </w:r>
     </w:p>
@@ -3435,23 +3163,7 @@
           <w:color w:val="000000" w:themeColor="text1"/>
           <w:sz w:val="20"/>
         </w:rPr>
-        <w:t xml:space="preserve">I have read and understood the terms and conditions of this engagement </w:t>
-      </w:r>
-      <w:proofErr w:type="gramStart"/>
-      <w:r>
-        <w:rPr>
-          <w:color w:val="000000" w:themeColor="text1"/>
-          <w:sz w:val="20"/>
-        </w:rPr>
-        <w:t>letter</w:t>
-      </w:r>
-      <w:proofErr w:type="gramEnd"/>
-      <w:r>
-        <w:rPr>
-          <w:color w:val="000000" w:themeColor="text1"/>
-          <w:sz w:val="20"/>
-        </w:rPr>
-        <w:t xml:space="preserve"> and I agree to accept them for and on behalf of </w:t>
+        <w:t xml:space="preserve">I have read and understood the terms and conditions of this engagement letter and I agree to accept them for and on behalf of </w:t>
       </w:r>
       <w:r>
         <w:rPr>
@@ -3808,27 +3520,7 @@
           <w:iCs/>
           <w:sz w:val="20"/>
         </w:rPr>
-        <w:t xml:space="preserve">Our focus will be to understand and analyze the regular cash distributions that are available to holders of the shares of the </w:t>
-      </w:r>
-      <w:proofErr w:type="spellStart"/>
-      <w:r>
-        <w:rPr>
-          <w:rFonts w:asciiTheme="minorHAnsi" w:hAnsiTheme="minorHAnsi" w:cstheme="minorHAnsi"/>
-          <w:i/>
-          <w:iCs/>
-          <w:sz w:val="20"/>
-        </w:rPr>
-        <w:t>HoldCos</w:t>
-      </w:r>
-      <w:proofErr w:type="spellEnd"/>
-      <w:r>
-        <w:rPr>
-          <w:rFonts w:asciiTheme="minorHAnsi" w:hAnsiTheme="minorHAnsi" w:cstheme="minorHAnsi"/>
-          <w:i/>
-          <w:iCs/>
-          <w:sz w:val="20"/>
-        </w:rPr>
-        <w:t>.</w:t>
+        <w:t>Our focus will be to understand and analyze the regular cash distributions that are available to holders of the shares of the HoldCos.</w:t>
       </w:r>
     </w:p>
     <w:p>
@@ -4096,17 +3788,8 @@
           <w:rFonts w:asciiTheme="minorHAnsi" w:hAnsiTheme="minorHAnsi" w:cstheme="minorHAnsi"/>
           <w:sz w:val="20"/>
         </w:rPr>
-        <w:t xml:space="preserve">Interview management, read presentations and other relevant documentation provided by management, and prepare a summary of the background of each of the assets, a description of the recent reorganization, and the operational history and financial </w:t>
-      </w:r>
-      <w:proofErr w:type="gramStart"/>
-      <w:r>
-        <w:rPr>
-          <w:rFonts w:asciiTheme="minorHAnsi" w:hAnsiTheme="minorHAnsi" w:cstheme="minorHAnsi"/>
-          <w:sz w:val="20"/>
-        </w:rPr>
-        <w:t>performance;</w:t>
-      </w:r>
-      <w:proofErr w:type="gramEnd"/>
+        <w:t>Interview management, read presentations and other relevant documentation provided by management, and prepare a summary of the background of each of the assets, a description of the recent reorganization, and the operational history and financial performance;</w:t>
+      </w:r>
     </w:p>
     <w:p>
       <w:pPr>
@@ -4126,17 +3809,8 @@
           <w:rFonts w:asciiTheme="minorHAnsi" w:hAnsiTheme="minorHAnsi" w:cstheme="minorHAnsi"/>
           <w:sz w:val="20"/>
         </w:rPr>
-        <w:t xml:space="preserve">Comment on significant accounting policies and their consistent application during the period under review and comment on any change in accounting policies and/or </w:t>
-      </w:r>
-      <w:proofErr w:type="gramStart"/>
-      <w:r>
-        <w:rPr>
-          <w:rFonts w:asciiTheme="minorHAnsi" w:hAnsiTheme="minorHAnsi" w:cstheme="minorHAnsi"/>
-          <w:sz w:val="20"/>
-        </w:rPr>
-        <w:t>auditors;</w:t>
-      </w:r>
-      <w:proofErr w:type="gramEnd"/>
+        <w:t>Comment on significant accounting policies and their consistent application during the period under review and comment on any change in accounting policies and/or auditors;</w:t>
+      </w:r>
     </w:p>
     <w:p>
       <w:pPr>
@@ -4156,17 +3830,8 @@
           <w:rFonts w:asciiTheme="minorHAnsi" w:hAnsiTheme="minorHAnsi" w:cstheme="minorHAnsi"/>
           <w:sz w:val="20"/>
         </w:rPr>
-        <w:t>Comment on the status of any financial statements provided (e.g. audited, reviewed, unaudited, IFRS, etc.</w:t>
-      </w:r>
-      <w:proofErr w:type="gramStart"/>
-      <w:r>
-        <w:rPr>
-          <w:rFonts w:asciiTheme="minorHAnsi" w:hAnsiTheme="minorHAnsi" w:cstheme="minorHAnsi"/>
-          <w:sz w:val="20"/>
-        </w:rPr>
-        <w:t>);</w:t>
-      </w:r>
-      <w:proofErr w:type="gramEnd"/>
+        <w:t>Comment on the status of any financial statements provided (e.g. audited, reviewed, unaudited, IFRS, etc.);</w:t>
+      </w:r>
     </w:p>
     <w:p>
       <w:pPr>
@@ -4253,33 +3918,8 @@
           <w:rFonts w:asciiTheme="minorHAnsi" w:hAnsiTheme="minorHAnsi" w:cstheme="minorHAnsi"/>
           <w:sz w:val="20"/>
         </w:rPr>
-        <w:t xml:space="preserve">Understand and summarize the terms (including distribution rights) of the shares of the </w:t>
-      </w:r>
-      <w:proofErr w:type="spellStart"/>
-      <w:r>
-        <w:rPr>
-          <w:rFonts w:asciiTheme="minorHAnsi" w:hAnsiTheme="minorHAnsi" w:cstheme="minorHAnsi"/>
-          <w:sz w:val="20"/>
-        </w:rPr>
-        <w:t>HoldCos</w:t>
-      </w:r>
-      <w:proofErr w:type="spellEnd"/>
-      <w:r>
-        <w:rPr>
-          <w:rFonts w:asciiTheme="minorHAnsi" w:hAnsiTheme="minorHAnsi" w:cstheme="minorHAnsi"/>
-          <w:sz w:val="20"/>
-        </w:rPr>
-        <w:t xml:space="preserve"> which are included in the </w:t>
-      </w:r>
-      <w:proofErr w:type="gramStart"/>
-      <w:r>
-        <w:rPr>
-          <w:rFonts w:asciiTheme="minorHAnsi" w:hAnsiTheme="minorHAnsi" w:cstheme="minorHAnsi"/>
-          <w:sz w:val="20"/>
-        </w:rPr>
-        <w:t>Transaction;</w:t>
-      </w:r>
-      <w:proofErr w:type="gramEnd"/>
+        <w:t>Understand and summarize the terms (including distribution rights) of the shares of the HoldCos which are included in the Transaction;</w:t>
+      </w:r>
     </w:p>
     <w:p>
       <w:pPr>
@@ -4388,17 +4028,8 @@
           <w:rFonts w:asciiTheme="minorHAnsi" w:hAnsiTheme="minorHAnsi" w:cstheme="minorHAnsi"/>
           <w:sz w:val="20"/>
         </w:rPr>
-        <w:t xml:space="preserve">Revenue recognition </w:t>
-      </w:r>
-      <w:proofErr w:type="gramStart"/>
-      <w:r>
-        <w:rPr>
-          <w:rFonts w:asciiTheme="minorHAnsi" w:hAnsiTheme="minorHAnsi" w:cstheme="minorHAnsi"/>
-          <w:sz w:val="20"/>
-        </w:rPr>
-        <w:t>policies;</w:t>
-      </w:r>
-      <w:proofErr w:type="gramEnd"/>
+        <w:t>Revenue recognition policies;</w:t>
+      </w:r>
     </w:p>
     <w:p>
       <w:pPr>
@@ -4419,17 +4050,8 @@
           <w:rFonts w:asciiTheme="minorHAnsi" w:hAnsiTheme="minorHAnsi" w:cstheme="minorHAnsi"/>
           <w:sz w:val="20"/>
         </w:rPr>
-        <w:t xml:space="preserve">Historical </w:t>
-      </w:r>
-      <w:proofErr w:type="gramStart"/>
-      <w:r>
-        <w:rPr>
-          <w:rFonts w:asciiTheme="minorHAnsi" w:hAnsiTheme="minorHAnsi" w:cstheme="minorHAnsi"/>
-          <w:sz w:val="20"/>
-        </w:rPr>
-        <w:t>tariffs;</w:t>
-      </w:r>
-      <w:proofErr w:type="gramEnd"/>
+        <w:t>Historical tariffs;</w:t>
+      </w:r>
     </w:p>
     <w:p>
       <w:pPr>
@@ -4450,17 +4072,8 @@
           <w:rFonts w:asciiTheme="minorHAnsi" w:hAnsiTheme="minorHAnsi" w:cstheme="minorHAnsi"/>
           <w:sz w:val="20"/>
         </w:rPr>
-        <w:t xml:space="preserve">Volume and pricing </w:t>
-      </w:r>
-      <w:proofErr w:type="gramStart"/>
-      <w:r>
-        <w:rPr>
-          <w:rFonts w:asciiTheme="minorHAnsi" w:hAnsiTheme="minorHAnsi" w:cstheme="minorHAnsi"/>
-          <w:sz w:val="20"/>
-        </w:rPr>
-        <w:t>trends;</w:t>
-      </w:r>
-      <w:proofErr w:type="gramEnd"/>
+        <w:t>Volume and pricing trends;</w:t>
+      </w:r>
     </w:p>
     <w:p>
       <w:pPr>
@@ -4547,17 +4160,8 @@
           <w:rFonts w:asciiTheme="minorHAnsi" w:hAnsiTheme="minorHAnsi" w:cstheme="minorHAnsi"/>
           <w:sz w:val="20"/>
         </w:rPr>
-        <w:t xml:space="preserve">Key operating expenditures, composition, and </w:t>
-      </w:r>
-      <w:proofErr w:type="gramStart"/>
-      <w:r>
-        <w:rPr>
-          <w:rFonts w:asciiTheme="minorHAnsi" w:hAnsiTheme="minorHAnsi" w:cstheme="minorHAnsi"/>
-          <w:sz w:val="20"/>
-        </w:rPr>
-        <w:t>trends;</w:t>
-      </w:r>
-      <w:proofErr w:type="gramEnd"/>
+        <w:t>Key operating expenditures, composition, and trends;</w:t>
+      </w:r>
     </w:p>
     <w:p>
       <w:pPr>
@@ -4578,17 +4182,8 @@
           <w:rFonts w:asciiTheme="minorHAnsi" w:hAnsiTheme="minorHAnsi" w:cstheme="minorHAnsi"/>
           <w:sz w:val="20"/>
         </w:rPr>
-        <w:t xml:space="preserve">Related party </w:t>
-      </w:r>
-      <w:proofErr w:type="gramStart"/>
-      <w:r>
-        <w:rPr>
-          <w:rFonts w:asciiTheme="minorHAnsi" w:hAnsiTheme="minorHAnsi" w:cstheme="minorHAnsi"/>
-          <w:sz w:val="20"/>
-        </w:rPr>
-        <w:t>transactions;</w:t>
-      </w:r>
-      <w:proofErr w:type="gramEnd"/>
+        <w:t>Related party transactions;</w:t>
+      </w:r>
     </w:p>
     <w:p>
       <w:pPr>
@@ -4685,17 +4280,8 @@
           <w:rFonts w:asciiTheme="minorHAnsi" w:hAnsiTheme="minorHAnsi" w:cstheme="minorHAnsi"/>
           <w:sz w:val="20"/>
         </w:rPr>
-        <w:t xml:space="preserve">Composition and </w:t>
-      </w:r>
-      <w:proofErr w:type="gramStart"/>
-      <w:r>
-        <w:rPr>
-          <w:rFonts w:asciiTheme="minorHAnsi" w:hAnsiTheme="minorHAnsi" w:cstheme="minorHAnsi"/>
-          <w:sz w:val="20"/>
-        </w:rPr>
-        <w:t>trends;</w:t>
-      </w:r>
-      <w:proofErr w:type="gramEnd"/>
+        <w:t>Composition and trends;</w:t>
+      </w:r>
     </w:p>
     <w:p>
       <w:pPr>
@@ -4716,17 +4302,8 @@
           <w:rFonts w:asciiTheme="minorHAnsi" w:hAnsiTheme="minorHAnsi" w:cstheme="minorHAnsi"/>
           <w:sz w:val="20"/>
         </w:rPr>
-        <w:t xml:space="preserve">Financing </w:t>
-      </w:r>
-      <w:proofErr w:type="gramStart"/>
-      <w:r>
-        <w:rPr>
-          <w:rFonts w:asciiTheme="minorHAnsi" w:hAnsiTheme="minorHAnsi" w:cstheme="minorHAnsi"/>
-          <w:sz w:val="20"/>
-        </w:rPr>
-        <w:t>costs;</w:t>
-      </w:r>
-      <w:proofErr w:type="gramEnd"/>
+        <w:t>Financing costs;</w:t>
+      </w:r>
     </w:p>
     <w:p>
       <w:pPr>
@@ -5058,15 +4635,7 @@
         <w:t>Confidential Information</w:t>
       </w:r>
       <w:r>
-        <w:t>” means any information made available, directly or indirectly, by one party to the other in connection with the Services or otherwise pursuant to this Agreement that is marked or communicated as confidential or that due to its nature a reasonable person under like circumstances would consider it confidential. Confidential Information includes, without limitation, Personal Information, business plans, proprietary software code and specifications, information about a party’s  products, processes, services, finances and customers, and the terms of this Agreement, except (but not as regards Personal Information) to the extent such information: (</w:t>
-      </w:r>
-      <w:proofErr w:type="spellStart"/>
-      <w:r>
-        <w:t>i</w:t>
-      </w:r>
-      <w:proofErr w:type="spellEnd"/>
-      <w:r>
-        <w:t>) is or hereafter enters the public domain through no fault of the receiving party; (ii) is already or hereafter becomes known to the receiving party free of any obligation of confidence; or (iii) is developed by the receiving party independently of the disclosing party’s Confidential Information.</w:t>
+        <w:t>” means any information made available, directly or indirectly, by one party to the other in connection with the Services or otherwise pursuant to this Agreement that is marked or communicated as confidential or that due to its nature a reasonable person under like circumstances would consider it confidential. Confidential Information includes, without limitation, Personal Information, business plans, proprietary software code and specifications, information about a party’s  products, processes, services, finances and customers, and the terms of this Agreement, except (but not as regards Personal Information) to the extent such information: (i) is or hereafter enters the public domain through no fault of the receiving party; (ii) is already or hereafter becomes known to the receiving party free of any obligation of confidence; or (iii) is developed by the receiving party independently of the disclosing party’s Confidential Information.</w:t>
       </w:r>
     </w:p>
     <w:p>
@@ -5336,15 +4905,7 @@
         <w:t>KPMG Property</w:t>
       </w:r>
       <w:r>
-        <w:t>” means all rights and interest (including all intellectual property rights) in and to: (</w:t>
-      </w:r>
-      <w:proofErr w:type="spellStart"/>
-      <w:r>
-        <w:t>i</w:t>
-      </w:r>
-      <w:proofErr w:type="spellEnd"/>
-      <w:r>
-        <w:t>) all inventions, trade-secrets, methodologies, know-how, concepts, ideas, techniques, works of authorship (including templates, art work and graphics), technology (including software applications, code, scripts, connectors and tools) and other proprietary materials and information that is licensed, owned or developed by KPMG prior to, independently of, or in the course of providing the Services, and any enhancements, improvements and modifications made to, or derivative works of, any of the foregoing; and (ii) KPMG’s working papers, working drafts and internal correspondence.  For certainty, KPMG Property does not include Client Confidential Information</w:t>
+        <w:t>” means all rights and interest (including all intellectual property rights) in and to: (i) all inventions, trade-secrets, methodologies, know-how, concepts, ideas, techniques, works of authorship (including templates, art work and graphics), technology (including software applications, code, scripts, connectors and tools) and other proprietary materials and information that is licensed, owned or developed by KPMG prior to, independently of, or in the course of providing the Services, and any enhancements, improvements and modifications made to, or derivative works of, any of the foregoing; and (ii) KPMG’s working papers, working drafts and internal correspondence.  For certainty, KPMG Property does not include Client Confidential Information</w:t>
       </w:r>
       <w:r>
         <w:t xml:space="preserve"> or Client Materials</w:t>
@@ -5610,15 +5171,7 @@
         <w:t>KPMG Resources to assist KPMG in the performance of the Services</w:t>
       </w:r>
       <w:r>
-        <w:t xml:space="preserve">, </w:t>
-      </w:r>
-      <w:proofErr w:type="gramStart"/>
-      <w:r>
-        <w:t>provided that</w:t>
-      </w:r>
-      <w:proofErr w:type="gramEnd"/>
-      <w:r>
-        <w:t xml:space="preserve"> </w:t>
+        <w:t xml:space="preserve">, provided that </w:t>
       </w:r>
       <w:r>
         <w:t xml:space="preserve">KPMG remains responsible to Client for the performance of any Services by KPMG Resources. Client agrees that any </w:t>
@@ -5873,15 +5426,7 @@
       </w:pPr>
       <w:bookmarkStart w:id="17" w:name="_Ref159424334"/>
       <w:r>
-        <w:t>Client agrees that, while the Services may include advice and recommendations, all decisions in connection with the implementation of such advice and recommendations shall be the responsibility of, and made by, Client.  Client, and not KPMG, shall perform the following functions: (</w:t>
-      </w:r>
-      <w:proofErr w:type="spellStart"/>
-      <w:r>
-        <w:t>i</w:t>
-      </w:r>
-      <w:proofErr w:type="spellEnd"/>
-      <w:r>
-        <w:t>) make all management decisions and perform all management functions; (ii) designate an individual who possesses suitable skill, knowledge and experience, preferably within senior management, to oversee the performance of the Services, and to evaluate the adequacy and results of such Services; (iii) accept responsibility for the results of such Services; and (iv) establis</w:t>
+        <w:t>Client agrees that, while the Services may include advice and recommendations, all decisions in connection with the implementation of such advice and recommendations shall be the responsibility of, and made by, Client.  Client, and not KPMG, shall perform the following functions: (i) make all management decisions and perform all management functions; (ii) designate an individual who possesses suitable skill, knowledge and experience, preferably within senior management, to oversee the performance of the Services, and to evaluate the adequacy and results of such Services; (iii) accept responsibility for the results of such Services; and (iv) establis</w:t>
       </w:r>
       <w:r>
         <w:t>h and maintain internal controls over the processes with which such Services are concerned, including, without limitation, monitoring ongoing activities.</w:t>
@@ -5936,15 +5481,7 @@
       </w:pPr>
       <w:bookmarkStart w:id="19" w:name="_Hlk148701458"/>
       <w:r>
-        <w:t>Subject to Client’s payment in full of all fees owing under the Engagement Letter: (</w:t>
-      </w:r>
-      <w:proofErr w:type="spellStart"/>
-      <w:r>
-        <w:t>i</w:t>
-      </w:r>
-      <w:proofErr w:type="spellEnd"/>
-      <w:r>
-        <w:t>) Client shall be the owner of any final Deliverable</w:t>
+        <w:t>Subject to Client’s payment in full of all fees owing under the Engagement Letter: (i) Client shall be the owner of any final Deliverable</w:t>
       </w:r>
       <w:r>
         <w:t>s</w:t>
@@ -6119,15 +5656,7 @@
       </w:pPr>
       <w:bookmarkStart w:id="21" w:name="_Ref159424163"/>
       <w:r>
-        <w:t>Client may disclose a copy of any final Deliverable: (</w:t>
-      </w:r>
-      <w:proofErr w:type="spellStart"/>
-      <w:r>
-        <w:t>i</w:t>
-      </w:r>
-      <w:proofErr w:type="spellEnd"/>
-      <w:r>
-        <w:t>) in response to a Legal Demand or otherwise to the extent required by law; (ii) on a non-</w:t>
+        <w:t>Client may disclose a copy of any final Deliverable: (i) in response to a Legal Demand or otherwise to the extent required by law; (ii) on a non-</w:t>
       </w:r>
       <w:r>
         <w:t>reliance basis to Client’s legal and other professional advis</w:t>
@@ -6406,15 +5935,7 @@
         <w:jc w:val="left"/>
       </w:pPr>
       <w:r>
-        <w:t>The receiving party may disclose Confidential Information of the disclosing party: (</w:t>
-      </w:r>
-      <w:proofErr w:type="spellStart"/>
-      <w:r>
-        <w:t>i</w:t>
-      </w:r>
-      <w:proofErr w:type="spellEnd"/>
-      <w:r>
-        <w:t>) to the extent required by law or professional standards; (ii) to its professional advisors and insurers in relation to any dispute concerning this Agreement; and (iii) in the case of a Legal Demand, provided that the receiving party will exercise commercially reasonable efforts to afford the Confidential Information all available confidentiality protections.</w:t>
+        <w:t>The receiving party may disclose Confidential Information of the disclosing party: (i) to the extent required by law or professional standards; (ii) to its professional advisors and insurers in relation to any dispute concerning this Agreement; and (iii) in the case of a Legal Demand, provided that the receiving party will exercise commercially reasonable efforts to afford the Confidential Information all available confidentiality protections.</w:t>
       </w:r>
     </w:p>
     <w:p>
@@ -6484,15 +6005,7 @@
         <w:jc w:val="left"/>
       </w:pPr>
       <w:r>
-        <w:t xml:space="preserve">KPMG may disclose the general nature of its engagement for Client as reasonably required </w:t>
-      </w:r>
-      <w:proofErr w:type="gramStart"/>
-      <w:r>
-        <w:t>in order to</w:t>
-      </w:r>
-      <w:proofErr w:type="gramEnd"/>
-      <w:r>
-        <w:t xml:space="preserve"> assess and address conflicts of interest.</w:t>
+        <w:t>KPMG may disclose the general nature of its engagement for Client as reasonably required in order to assess and address conflicts of interest.</w:t>
       </w:r>
     </w:p>
     <w:p>
@@ -6583,15 +6096,7 @@
         <w:t>party</w:t>
       </w:r>
       <w:r>
-        <w:t xml:space="preserve"> shall provide the other with information and co-operation relating to its processing of Personal Information as reasonably required </w:t>
-      </w:r>
-      <w:proofErr w:type="gramStart"/>
-      <w:r>
-        <w:t>in order for</w:t>
-      </w:r>
-      <w:proofErr w:type="gramEnd"/>
-      <w:r>
-        <w:t xml:space="preserve"> the other to satisfy its obligations under Privacy Laws.</w:t>
+        <w:t xml:space="preserve"> shall provide the other with information and co-operation relating to its processing of Personal Information as reasonably required in order for the other to satisfy its obligations under Privacy Laws.</w:t>
       </w:r>
     </w:p>
     <w:p>
@@ -6937,21 +6442,7 @@
         <w:rPr>
           <w:bCs/>
         </w:rPr>
-        <w:t xml:space="preserve"> except to the extent finally determined to have resulted from KPMG’s fraud or </w:t>
-      </w:r>
-      <w:proofErr w:type="spellStart"/>
-      <w:r>
-        <w:rPr>
-          <w:bCs/>
-        </w:rPr>
-        <w:t>wilful</w:t>
-      </w:r>
-      <w:proofErr w:type="spellEnd"/>
-      <w:r>
-        <w:rPr>
-          <w:bCs/>
-        </w:rPr>
-        <w:t xml:space="preserve"> misconduct</w:t>
+        <w:t xml:space="preserve"> except to the extent finally determined to have resulted from KPMG’s fraud or wilful misconduct</w:t>
       </w:r>
       <w:r>
         <w:rPr>
@@ -7082,71 +6573,71 @@
         <w:rPr>
           <w:bCs/>
         </w:rPr>
+        <w:instrText xml:space="preserve"> \* MERGEFORMAT </w:instrText>
       </w:r>
       <w:r>
         <w:rPr>
           <w:bCs/>
         </w:rPr>
+      </w:r>
+      <w:r>
+        <w:rPr>
+          <w:bCs/>
+        </w:rPr>
+        <w:fldChar w:fldCharType="separate"/>
+      </w:r>
+      <w:r>
+        <w:rPr>
+          <w:bCs/>
+        </w:rPr>
+        <w:t>a</w:t>
+      </w:r>
+      <w:r>
+        <w:rPr>
+          <w:bCs/>
+        </w:rPr>
+        <w:fldChar w:fldCharType="end"/>
+      </w:r>
+      <w:r>
+        <w:rPr>
+          <w:bCs/>
+        </w:rPr>
+        <w:t>)</w:t>
+      </w:r>
+      <w:r>
+        <w:rPr>
+          <w:bCs/>
+        </w:rPr>
+        <w:t xml:space="preserve"> and </w:t>
+      </w:r>
+      <w:r>
+        <w:rPr>
+          <w:bCs/>
+        </w:rPr>
+        <w:t>(</w:t>
+      </w:r>
+      <w:r>
+        <w:rPr>
+          <w:bCs/>
+        </w:rPr>
+        <w:fldChar w:fldCharType="begin"/>
+      </w:r>
+      <w:r>
+        <w:rPr>
+          <w:bCs/>
+        </w:rPr>
+        <w:instrText xml:space="preserve"> REF _Ref159424269 \r \h </w:instrText>
+      </w:r>
+      <w:r>
+        <w:rPr>
+          <w:bCs/>
+        </w:rPr>
         <w:instrText xml:space="preserve"> \* MERGEFORMAT </w:instrText>
       </w:r>
       <w:r>
         <w:rPr>
           <w:bCs/>
         </w:rPr>
-        <w:fldChar w:fldCharType="separate"/>
-      </w:r>
-      <w:r>
-        <w:rPr>
-          <w:bCs/>
-        </w:rPr>
-        <w:t>a</w:t>
-      </w:r>
-      <w:r>
-        <w:rPr>
-          <w:bCs/>
-        </w:rPr>
-        <w:fldChar w:fldCharType="end"/>
-      </w:r>
-      <w:r>
-        <w:rPr>
-          <w:bCs/>
-        </w:rPr>
-        <w:t>)</w:t>
-      </w:r>
-      <w:r>
-        <w:rPr>
-          <w:bCs/>
-        </w:rPr>
-        <w:t xml:space="preserve"> and </w:t>
-      </w:r>
-      <w:r>
-        <w:rPr>
-          <w:bCs/>
-        </w:rPr>
-        <w:t>(</w:t>
-      </w:r>
-      <w:r>
-        <w:rPr>
-          <w:bCs/>
-        </w:rPr>
-        <w:fldChar w:fldCharType="begin"/>
-      </w:r>
-      <w:r>
-        <w:rPr>
-          <w:bCs/>
-        </w:rPr>
-        <w:instrText xml:space="preserve"> REF _Ref159424269 \r \h </w:instrText>
-      </w:r>
-      <w:r>
-        <w:rPr>
-          <w:bCs/>
-        </w:rPr>
-      </w:r>
-      <w:r>
-        <w:rPr>
-          <w:bCs/>
-        </w:rPr>
-        <w:instrText xml:space="preserve"> \* MERGEFORMAT </w:instrText>
       </w:r>
       <w:r>
         <w:rPr>
@@ -7366,15 +6857,7 @@
         <w:t>This Agreement may be terminated by either party</w:t>
       </w:r>
       <w:r>
-        <w:t>: (</w:t>
-      </w:r>
-      <w:proofErr w:type="spellStart"/>
-      <w:r>
-        <w:t>i</w:t>
-      </w:r>
-      <w:proofErr w:type="spellEnd"/>
-      <w:r>
-        <w:t>)</w:t>
+        <w:t>: (i)</w:t>
       </w:r>
       <w:r>
         <w:t xml:space="preserve"> at any time by giving written notice to the other party not less than 30 days before the effective date of termination</w:t>
@@ -7678,15 +7161,7 @@
         <w:jc w:val="left"/>
       </w:pPr>
       <w:r>
-        <w:t xml:space="preserve">Neither party shall be liable for any delays in the performance of its obligations hereunder, other than payment obligations, arising out of or caused by, directly or indirectly, circumstances or causes beyond its control, including, without limitation, fire or other casualty, strike or </w:t>
-      </w:r>
-      <w:proofErr w:type="spellStart"/>
-      <w:r>
-        <w:t>labour</w:t>
-      </w:r>
-      <w:proofErr w:type="spellEnd"/>
-      <w:r>
-        <w:t xml:space="preserve"> dispute, war or other violence, any law, order or requirement of any governmental agency or authority, or any epidemic, pandemic or quarantine.</w:t>
+        <w:t>Neither party shall be liable for any delays in the performance of its obligations hereunder, other than payment obligations, arising out of or caused by, directly or indirectly, circumstances or causes beyond its control, including, without limitation, fire or other casualty, strike or labour dispute, war or other violence, any law, order or requirement of any governmental agency or authority, or any epidemic, pandemic or quarantine.</w:t>
       </w:r>
     </w:p>
     <w:p>
@@ -7810,27 +7285,7 @@
           <w:sz w:val="16"/>
           <w:szCs w:val="16"/>
         </w:rPr>
-        <w:t xml:space="preserve"> </w:t>
-      </w:r>
-      <w:proofErr w:type="gramStart"/>
-      <w:r>
-        <w:rPr>
-          <w:rFonts w:cs="Arial"/>
-          <w:color w:val="000000"/>
-          <w:sz w:val="16"/>
-          <w:szCs w:val="16"/>
-        </w:rPr>
-        <w:t>whether or not</w:t>
-      </w:r>
-      <w:proofErr w:type="gramEnd"/>
-      <w:r>
-        <w:rPr>
-          <w:rFonts w:cs="Arial"/>
-          <w:color w:val="000000"/>
-          <w:sz w:val="16"/>
-          <w:szCs w:val="16"/>
-        </w:rPr>
-        <w:t xml:space="preserve"> KPMG is </w:t>
+        <w:t xml:space="preserve"> whether or not KPMG is </w:t>
       </w:r>
       <w:r>
         <w:rPr>
@@ -8069,15 +7524,7 @@
         <w:t xml:space="preserve"> </w:t>
       </w:r>
       <w:r>
-        <w:t xml:space="preserve">and </w:t>
-      </w:r>
-      <w:proofErr w:type="spellStart"/>
-      <w:r>
-        <w:t>enure</w:t>
-      </w:r>
-      <w:proofErr w:type="spellEnd"/>
-      <w:r>
-        <w:t xml:space="preserve"> to the benefit of</w:t>
+        <w:t>and enure to the benefit of</w:t>
       </w:r>
       <w:r>
         <w:t xml:space="preserve"> the parties hereto and their respective successors</w:t>
@@ -8102,15 +7549,7 @@
         <w:t>A</w:t>
       </w:r>
       <w:r>
-        <w:t xml:space="preserve">ffiliate or successor in interest to all or substantially </w:t>
-      </w:r>
-      <w:proofErr w:type="gramStart"/>
-      <w:r>
-        <w:t>all of</w:t>
-      </w:r>
-      <w:proofErr w:type="gramEnd"/>
-      <w:r>
-        <w:t xml:space="preserve"> the assets or business of the relevant KPMG practice, without the consent of Client. </w:t>
+        <w:t xml:space="preserve">ffiliate or successor in interest to all or substantially all of the assets or business of the relevant KPMG practice, without the consent of Client. </w:t>
       </w:r>
     </w:p>
     <w:p>
@@ -8130,15 +7569,7 @@
       </w:pPr>
       <w:r>
         <w:lastRenderedPageBreak/>
-        <w:t xml:space="preserve">The provisions of this Agreement shall only apply to the extent that they are not prohibited by a mandatory provision of applicable law, regulation or professional standards. If any of these provisions shall be held to be invalid, void or unenforceable, the remaining provisions shall not be affected, impaired or invalidated, and each such provision shall </w:t>
-      </w:r>
-      <w:proofErr w:type="gramStart"/>
-      <w:r>
-        <w:t>be valid and enforceable to the fullest extent</w:t>
-      </w:r>
-      <w:proofErr w:type="gramEnd"/>
-      <w:r>
-        <w:t xml:space="preserve"> permitted by law.</w:t>
+        <w:t>The provisions of this Agreement shall only apply to the extent that they are not prohibited by a mandatory provision of applicable law, regulation or professional standards. If any of these provisions shall be held to be invalid, void or unenforceable, the remaining provisions shall not be affected, impaired or invalidated, and each such provision shall be valid and enforceable to the fullest extent permitted by law.</w:t>
       </w:r>
     </w:p>
     <w:p>
@@ -8263,15 +7694,7 @@
         <w:jc w:val="left"/>
       </w:pPr>
       <w:r>
-        <w:t xml:space="preserve">This Agreement shall be subject to and governed by the laws of the </w:t>
-      </w:r>
-      <w:proofErr w:type="gramStart"/>
-      <w:r>
-        <w:t>Province</w:t>
-      </w:r>
-      <w:proofErr w:type="gramEnd"/>
-      <w:r>
-        <w:t xml:space="preserve"> in which KPMG’s principal Canadian office performing the engagement is located (without regard to such Province’s rules on conflicts of law).</w:t>
+        <w:t>This Agreement shall be subject to and governed by the laws of the Province in which KPMG’s principal Canadian office performing the engagement is located (without regard to such Province’s rules on conflicts of law).</w:t>
       </w:r>
     </w:p>
     <w:p>
@@ -8367,31 +7790,7 @@
         <w:t>relevant</w:t>
       </w:r>
       <w:r>
-        <w:t xml:space="preserve"> taxing statutes, the regulations thereunder, applicable tax treaties and judicial and administrative interpretations thereof. In the case of Canadian tax services only, KPMG will also </w:t>
-      </w:r>
-      <w:proofErr w:type="gramStart"/>
-      <w:r>
-        <w:t>take into account</w:t>
-      </w:r>
-      <w:proofErr w:type="gramEnd"/>
-      <w:r>
-        <w:t xml:space="preserve"> all specific proposals to amend such statutes, regulations and treaties publicly announced prior to the date of KPMG's reports, based on the assumption that these amendments will be enacted substantially as proposed.  For certainty, in the case of US tax services, KPMG shall not </w:t>
-      </w:r>
-      <w:proofErr w:type="gramStart"/>
-      <w:r>
-        <w:t>take into account</w:t>
-      </w:r>
-      <w:proofErr w:type="gramEnd"/>
-      <w:r>
-        <w:t xml:space="preserve"> any specific proposals to amend such statutes, regulations and treaties. These authorities are subject to change, retroactively and/or prospectively, and any such changes could affect the validity of KPMG's advice and may result in incremental taxes, interest or penalties. KPMG’s advice will not otherwise </w:t>
-      </w:r>
-      <w:proofErr w:type="gramStart"/>
-      <w:r>
-        <w:t>take into account</w:t>
-      </w:r>
-      <w:proofErr w:type="gramEnd"/>
-      <w:r>
-        <w:t xml:space="preserve"> or anticipate any changes in law or practice, by way of judicial, governmental or legislative action or interpretation. Unless Client specifically requests otherwise, KPMG will not update tax work to take any such changes into account.</w:t>
+        <w:t xml:space="preserve"> taxing statutes, the regulations thereunder, applicable tax treaties and judicial and administrative interpretations thereof. In the case of Canadian tax services only, KPMG will also take into account all specific proposals to amend such statutes, regulations and treaties publicly announced prior to the date of KPMG's reports, based on the assumption that these amendments will be enacted substantially as proposed.  For certainty, in the case of US tax services, KPMG shall not take into account any specific proposals to amend such statutes, regulations and treaties. These authorities are subject to change, retroactively and/or prospectively, and any such changes could affect the validity of KPMG's advice and may result in incremental taxes, interest or penalties. KPMG’s advice will not otherwise take into account or anticipate any changes in law or practice, by way of judicial, governmental or legislative action or interpretation. Unless Client specifically requests otherwise, KPMG will not update tax work to take any such changes into account.</w:t>
       </w:r>
     </w:p>
     <w:p>
@@ -8429,23 +7828,7 @@
         <w:jc w:val="left"/>
       </w:pPr>
       <w:r>
-        <w:t xml:space="preserve">KPMG is not responsible for any taxes, penalties or interest assessed against Client, or for any form of loss suffered by Client, </w:t>
-      </w:r>
-      <w:proofErr w:type="gramStart"/>
-      <w:r>
-        <w:t>as a result of</w:t>
-      </w:r>
-      <w:proofErr w:type="gramEnd"/>
-      <w:r>
-        <w:t xml:space="preserve"> a failure by Client to (</w:t>
-      </w:r>
-      <w:proofErr w:type="spellStart"/>
-      <w:r>
-        <w:t>i</w:t>
-      </w:r>
-      <w:proofErr w:type="spellEnd"/>
-      <w:r>
-        <w:t>) provide KPMG with accurate and complete information or (ii) implement KPMG’s advice in accordance with KPMG’s recommendations.</w:t>
+        <w:t>KPMG is not responsible for any taxes, penalties or interest assessed against Client, or for any form of loss suffered by Client, as a result of a failure by Client to (i) provide KPMG with accurate and complete information or (ii) implement KPMG’s advice in accordance with KPMG’s recommendations.</w:t>
       </w:r>
     </w:p>
     <w:p>
@@ -8495,15 +7878,7 @@
         <w:t>Unless prevented by law, Client will use commercially reasonable efforts to inform KPMG if Client or any of Client’s other advisors is required to make an MDR Disclosure or if an MDR Disclosure was required prior to the engagement for any part of a series of transactions within the scope of the engagement. Client is advised to consult with a tax or legal professional service provider proficient in such MDRs for assistance in this regard; for greater certainty</w:t>
       </w:r>
       <w:r>
-        <w:t xml:space="preserve">, unless expressly provided for in the Engagement Letter, the Services do not include advice in relation to the application of, and compliance with, MDRs. To the fullest extent permitted by law, KPMG is not liable to Client for any consequences that may result or arise from or otherwise </w:t>
-      </w:r>
-      <w:proofErr w:type="gramStart"/>
-      <w:r>
-        <w:t>be connected with</w:t>
-      </w:r>
-      <w:proofErr w:type="gramEnd"/>
-      <w:r>
-        <w:t xml:space="preserve"> any MDR Disclosure made by KPMG or another Member Firm in good faith. </w:t>
+        <w:t xml:space="preserve">, unless expressly provided for in the Engagement Letter, the Services do not include advice in relation to the application of, and compliance with, MDRs. To the fullest extent permitted by law, KPMG is not liable to Client for any consequences that may result or arise from or otherwise be connected with any MDR Disclosure made by KPMG or another Member Firm in good faith. </w:t>
       </w:r>
     </w:p>
     <w:p>
@@ -8565,43 +7940,11 @@
         <w:fldChar w:fldCharType="end"/>
       </w:r>
       <w:r>
-        <w:t xml:space="preserve"> of these Terms and Conditions regarding the disclosure, publication or other distribution of KPMG’s reports and written advice or information provided by KPMG, or any similar prohibition set out in the Engagement Letter, shall not apply, and no provision of this Agreement is or is intended to be construed as: (</w:t>
-      </w:r>
-      <w:proofErr w:type="spellStart"/>
-      <w:r>
-        <w:t>i</w:t>
-      </w:r>
-      <w:proofErr w:type="spellEnd"/>
-      <w:r>
-        <w:t xml:space="preserve">) confidential protection </w:t>
+        <w:t xml:space="preserve"> of these Terms and Conditions regarding the disclosure, publication or other distribution of KPMG’s reports and written advice or information provided by KPMG, or any similar prohibition set out in the Engagement Letter, shall not apply, and no provision of this Agreement is or is intended to be construed as: (i) confidential protection </w:t>
       </w:r>
       <w:r>
         <w:lastRenderedPageBreak/>
-        <w:t>within the meaning of subsection 237.3(1) of the Income Tax Act (Canada) (the “ITA”) or any applicable regulations thereunder; (ii) a condition of confidentiality within the scope of the Internal Revenue Code of 1986 (“IRC”) section 6011 as implemented through Treasury Regulation 1.6011-4(b)(3)(</w:t>
-      </w:r>
-      <w:proofErr w:type="spellStart"/>
-      <w:r>
-        <w:t>i</w:t>
-      </w:r>
-      <w:proofErr w:type="spellEnd"/>
-      <w:r>
-        <w:t xml:space="preserve">) (without regard to references to payment or receipt of a minimum fee); or (iii) any similar confidentiality protection or condition under any similar or analogous provisions of the laws of any province, state or other jurisdiction. </w:t>
-      </w:r>
-      <w:proofErr w:type="gramStart"/>
-      <w:r>
-        <w:t>In particular, Client</w:t>
-      </w:r>
-      <w:proofErr w:type="gramEnd"/>
-      <w:r>
-        <w:t xml:space="preserve"> may disclose to </w:t>
-      </w:r>
-      <w:proofErr w:type="gramStart"/>
-      <w:r>
-        <w:t>any and all</w:t>
-      </w:r>
-      <w:proofErr w:type="gramEnd"/>
-      <w:r>
-        <w:t xml:space="preserve"> persons, without limitation of any kind, tax information, advice and other </w:t>
+        <w:t xml:space="preserve">within the meaning of subsection 237.3(1) of the Income Tax Act (Canada) (the “ITA”) or any applicable regulations thereunder; (ii) a condition of confidentiality within the scope of the Internal Revenue Code of 1986 (“IRC”) section 6011 as implemented through Treasury Regulation 1.6011-4(b)(3)(i) (without regard to references to payment or receipt of a minimum fee); or (iii) any similar confidentiality protection or condition under any similar or analogous provisions of the laws of any province, state or other jurisdiction. In particular, Client may disclose to any and all persons, without limitation of any kind, tax information, advice and other </w:t>
       </w:r>
       <w:r>
         <w:t>materials KPMG provides to Client relating to the tax treatment, details or structure of a transaction or series of transactions within the scope of the engagement.</w:t>
@@ -8629,15 +7972,7 @@
         <w:jc w:val="left"/>
       </w:pPr>
       <w:r>
-        <w:t>Notwithstanding the foregoing, Client acknowledges and agrees that all tax Services and Deliverables are designed to meet Client’s agreed requirements only, as determined by Client’s needs at the time, and are not suitable to be used by any party other than Client. KPMG assumes no responsibility and accepts no liability to any person or entity other than Client in respect of the tax Services and Deliverables. Accordingly, Client agrees, in connection with any disclosure by or on behalf of Client of any such information to a third party: (</w:t>
-      </w:r>
-      <w:proofErr w:type="spellStart"/>
-      <w:r>
-        <w:t>i</w:t>
-      </w:r>
-      <w:proofErr w:type="spellEnd"/>
-      <w:r>
-        <w:t xml:space="preserve">) </w:t>
+        <w:t xml:space="preserve">Notwithstanding the foregoing, Client acknowledges and agrees that all tax Services and Deliverables are designed to meet Client’s agreed requirements only, as determined by Client’s needs at the time, and are not suitable to be used by any party other than Client. KPMG assumes no responsibility and accepts no liability to any person or entity other than Client in respect of the tax Services and Deliverables. Accordingly, Client agrees, in connection with any disclosure by or on behalf of Client of any such information to a third party: (i) </w:t>
       </w:r>
       <w:r>
         <w:t xml:space="preserve">Client accepts the risk of such disclosure and will not hold KPMG responsible if such disclosure results in adversity to Client; (ii) </w:t>
@@ -8770,23 +8105,7 @@
           <w:bCs/>
           <w:lang w:val="en-CA"/>
         </w:rPr>
-        <w:t>As used herein, “Target” refers to the entity(</w:t>
-      </w:r>
-      <w:proofErr w:type="spellStart"/>
-      <w:r>
-        <w:rPr>
-          <w:bCs/>
-          <w:lang w:val="en-CA"/>
-        </w:rPr>
-        <w:t>ies</w:t>
-      </w:r>
-      <w:proofErr w:type="spellEnd"/>
-      <w:r>
-        <w:rPr>
-          <w:bCs/>
-          <w:lang w:val="en-CA"/>
-        </w:rPr>
-        <w:t>) or division(s) (which may include Client or divisions of Client) representing the subject of the due diligence assistance procedures, as set out in the Engagement Letter.</w:t>
+        <w:t>As used herein, “Target” refers to the entity(ies) or division(s) (which may include Client or divisions of Client) representing the subject of the due diligence assistance procedures, as set out in the Engagement Letter.</w:t>
       </w:r>
     </w:p>
     <w:p>
@@ -9800,23 +9119,7 @@
           <w:rFonts w:asciiTheme="minorHAnsi" w:hAnsiTheme="minorHAnsi" w:cstheme="minorHAnsi"/>
           <w:sz w:val="20"/>
         </w:rPr>
-        <w:t xml:space="preserve"> </w:t>
-      </w:r>
-      <w:proofErr w:type="gramStart"/>
-      <w:r>
-        <w:rPr>
-          <w:rFonts w:asciiTheme="minorHAnsi" w:hAnsiTheme="minorHAnsi" w:cstheme="minorHAnsi"/>
-          <w:sz w:val="20"/>
-        </w:rPr>
-        <w:t>are in agreement</w:t>
-      </w:r>
-      <w:proofErr w:type="gramEnd"/>
-      <w:r>
-        <w:rPr>
-          <w:rFonts w:asciiTheme="minorHAnsi" w:hAnsiTheme="minorHAnsi" w:cstheme="minorHAnsi"/>
-          <w:sz w:val="20"/>
-        </w:rPr>
-        <w:t xml:space="preserve"> with the terms of this letter and to the release of the Information to the Recipient and/or its professional advisors.</w:t>
+        <w:t xml:space="preserve"> are in agreement with the terms of this letter and to the release of the Information to the Recipient and/or its professional advisors.</w:t>
       </w:r>
     </w:p>
     <w:p>
@@ -11029,17 +10332,8 @@
           <w:rFonts w:ascii="Arial" w:hAnsi="Arial" w:cs="Arial"/>
           <w:sz w:val="20"/>
         </w:rPr>
-        <w:t xml:space="preserve">KPMG neither warrants nor represents that the Information is accurate, complete, sufficient or appropriate for any purpose contemplated by the Recipient or its professional </w:t>
-      </w:r>
-      <w:proofErr w:type="gramStart"/>
-      <w:r>
-        <w:rPr>
-          <w:rFonts w:ascii="Arial" w:hAnsi="Arial" w:cs="Arial"/>
-          <w:sz w:val="20"/>
-        </w:rPr>
-        <w:t>advisors;</w:t>
-      </w:r>
-      <w:proofErr w:type="gramEnd"/>
+        <w:t>KPMG neither warrants nor represents that the Information is accurate, complete, sufficient or appropriate for any purpose contemplated by the Recipient or its professional advisors;</w:t>
+      </w:r>
     </w:p>
     <w:p>
       <w:pPr>
@@ -11059,17 +10353,8 @@
           <w:rFonts w:ascii="Arial" w:hAnsi="Arial" w:cs="Arial"/>
           <w:sz w:val="20"/>
         </w:rPr>
-        <w:t xml:space="preserve">the Information is being provided by KPMG on a non-reliance basis, and KPMG shall not be liable for any reliance that the Recipient or its professional advisors may place on the </w:t>
-      </w:r>
-      <w:proofErr w:type="gramStart"/>
-      <w:r>
-        <w:rPr>
-          <w:rFonts w:ascii="Arial" w:hAnsi="Arial" w:cs="Arial"/>
-          <w:sz w:val="20"/>
-        </w:rPr>
-        <w:t>Information;</w:t>
-      </w:r>
-      <w:proofErr w:type="gramEnd"/>
+        <w:t>the Information is being provided by KPMG on a non-reliance basis, and KPMG shall not be liable for any reliance that the Recipient or its professional advisors may place on the Information;</w:t>
+      </w:r>
     </w:p>
     <w:p>
       <w:pPr>
@@ -11089,17 +10374,8 @@
           <w:rFonts w:ascii="Arial" w:hAnsi="Arial" w:cs="Arial"/>
           <w:sz w:val="20"/>
         </w:rPr>
-        <w:t xml:space="preserve">KPMG’s provision of the Information is not intended to replace any other inquiries or procedures that the Recipient or its professional advisors should undertake for their own </w:t>
-      </w:r>
-      <w:proofErr w:type="gramStart"/>
-      <w:r>
-        <w:rPr>
-          <w:rFonts w:ascii="Arial" w:hAnsi="Arial" w:cs="Arial"/>
-          <w:sz w:val="20"/>
-        </w:rPr>
-        <w:t>purposes;</w:t>
-      </w:r>
-      <w:proofErr w:type="gramEnd"/>
+        <w:t>KPMG’s provision of the Information is not intended to replace any other inquiries or procedures that the Recipient or its professional advisors should undertake for their own purposes;</w:t>
+      </w:r>
     </w:p>
     <w:p>
       <w:pPr>
@@ -11119,39 +10395,7 @@
           <w:rFonts w:ascii="Arial" w:hAnsi="Arial" w:cs="Arial"/>
           <w:sz w:val="20"/>
         </w:rPr>
-        <w:t xml:space="preserve">KPMG does not have any other duties, responsibilities or obligations to the Recipient or its professional advisors </w:t>
-      </w:r>
-      <w:proofErr w:type="gramStart"/>
-      <w:r>
-        <w:rPr>
-          <w:rFonts w:ascii="Arial" w:hAnsi="Arial" w:cs="Arial"/>
-          <w:sz w:val="20"/>
-        </w:rPr>
-        <w:t>as a result of</w:t>
-      </w:r>
-      <w:proofErr w:type="gramEnd"/>
-      <w:r>
-        <w:rPr>
-          <w:rFonts w:ascii="Arial" w:hAnsi="Arial" w:cs="Arial"/>
-          <w:sz w:val="20"/>
-        </w:rPr>
-        <w:t xml:space="preserve"> providing the </w:t>
-      </w:r>
-      <w:proofErr w:type="gramStart"/>
-      <w:r>
-        <w:rPr>
-          <w:rFonts w:ascii="Arial" w:hAnsi="Arial" w:cs="Arial"/>
-          <w:sz w:val="20"/>
-        </w:rPr>
-        <w:t>Information;</w:t>
-      </w:r>
-      <w:proofErr w:type="gramEnd"/>
-      <w:r>
-        <w:rPr>
-          <w:rFonts w:ascii="Arial" w:hAnsi="Arial" w:cs="Arial"/>
-          <w:sz w:val="20"/>
-        </w:rPr>
-        <w:t xml:space="preserve"> </w:t>
+        <w:t xml:space="preserve">KPMG does not have any other duties, responsibilities or obligations to the Recipient or its professional advisors as a result of providing the Information; </w:t>
       </w:r>
     </w:p>
     <w:p>
@@ -11209,23 +10453,7 @@
           <w:rFonts w:ascii="Arial" w:hAnsi="Arial" w:cs="Arial"/>
           <w:sz w:val="20"/>
         </w:rPr>
-        <w:t xml:space="preserve">if, notwithstanding the acknowledgement in paragraph e) above, a Claim is made against KPMG, the Recipient will fully release, indemnify and hold harmless KPMG from such Claims, including, without limitation, in respect of reasonable legal </w:t>
-      </w:r>
-      <w:proofErr w:type="gramStart"/>
-      <w:r>
-        <w:rPr>
-          <w:rFonts w:ascii="Arial" w:hAnsi="Arial" w:cs="Arial"/>
-          <w:sz w:val="20"/>
-        </w:rPr>
-        <w:t>fees;</w:t>
-      </w:r>
-      <w:proofErr w:type="gramEnd"/>
-      <w:r>
-        <w:rPr>
-          <w:rFonts w:ascii="Arial" w:hAnsi="Arial" w:cs="Arial"/>
-          <w:sz w:val="20"/>
-        </w:rPr>
-        <w:t xml:space="preserve"> </w:t>
+        <w:t xml:space="preserve">if, notwithstanding the acknowledgement in paragraph e) above, a Claim is made against KPMG, the Recipient will fully release, indemnify and hold harmless KPMG from such Claims, including, without limitation, in respect of reasonable legal fees; </w:t>
       </w:r>
     </w:p>
     <w:p>
@@ -11270,21 +10498,12 @@
           <w:sz w:val="20"/>
         </w:rPr>
       </w:pPr>
-      <w:proofErr w:type="gramStart"/>
       <w:r>
         <w:rPr>
           <w:rFonts w:ascii="Arial" w:hAnsi="Arial" w:cs="Arial"/>
           <w:sz w:val="20"/>
         </w:rPr>
-        <w:t>in the event that</w:t>
-      </w:r>
-      <w:proofErr w:type="gramEnd"/>
-      <w:r>
-        <w:rPr>
-          <w:rFonts w:ascii="Arial" w:hAnsi="Arial" w:cs="Arial"/>
-          <w:sz w:val="20"/>
-        </w:rPr>
-        <w:t xml:space="preserve"> disclosure of the Information is required by law or professional standards, the Recipient and its professional advisors shall notify KPMG promptly prior to making such disclosure unless prohibited from doing so under applicable law.</w:t>
+        <w:t>in the event that disclosure of the Information is required by law or professional standards, the Recipient and its professional advisors shall notify KPMG promptly prior to making such disclosure unless prohibited from doing so under applicable law.</w:t>
       </w:r>
     </w:p>
     <w:p>
@@ -12774,21 +11993,7 @@
       <w:rPr>
         <w:sz w:val="20"/>
       </w:rPr>
-      <w:t xml:space="preserve">Toronto </w:t>
-    </w:r>
-    <w:proofErr w:type="gramStart"/>
-    <w:r>
-      <w:rPr>
-        <w:sz w:val="20"/>
-      </w:rPr>
-      <w:t>ON  M</w:t>
-    </w:r>
-    <w:proofErr w:type="gramEnd"/>
-    <w:r>
-      <w:rPr>
-        <w:sz w:val="20"/>
-      </w:rPr>
-      <w:t>5H 2S5</w:t>
+      <w:t>Toronto ON  M5H 2S5</w:t>
     </w:r>
   </w:p>
   <w:p>

</xml_diff>